<commit_message>
added a supplemental figure, incomplete
</commit_message>
<xml_diff>
--- a/Docs/00_CanJFS/R1_18062026/R1_CanJFS_AllFigures.docx
+++ b/Docs/00_CanJFS/R1_18062026/R1_CanJFS_AllFigures.docx
@@ -216,18 +216,240 @@
     <w:p>
       <w:r>
         <w:rPr>
+          <w:rFonts w:ascii="Garamond" w:hAnsi="Garamond"/>
+          <w:noProof/>
+        </w:rPr>
+        <w:drawing>
+          <wp:anchor distT="0" distB="0" distL="114300" distR="114300" simplePos="0" relativeHeight="251655168" behindDoc="0" locked="0" layoutInCell="1" allowOverlap="1" wp14:anchorId="2B7003D6" wp14:editId="23163F38">
+            <wp:simplePos x="0" y="0"/>
+            <wp:positionH relativeFrom="column">
+              <wp:posOffset>236855</wp:posOffset>
+            </wp:positionH>
+            <wp:positionV relativeFrom="paragraph">
+              <wp:posOffset>315595</wp:posOffset>
+            </wp:positionV>
+            <wp:extent cx="4071620" cy="3146425"/>
+            <wp:effectExtent l="0" t="0" r="5080" b="3175"/>
+            <wp:wrapSquare wrapText="bothSides"/>
+            <wp:docPr id="1635802607" name="Picture 5" descr="A map of rivers and rivers&#10;&#10;AI-generated content may be incorrect."/>
+            <wp:cNvGraphicFramePr>
+              <a:graphicFrameLocks xmlns:a="http://schemas.openxmlformats.org/drawingml/2006/main" noChangeAspect="1"/>
+            </wp:cNvGraphicFramePr>
+            <a:graphic xmlns:a="http://schemas.openxmlformats.org/drawingml/2006/main">
+              <a:graphicData uri="http://schemas.openxmlformats.org/drawingml/2006/picture">
+                <pic:pic xmlns:pic="http://schemas.openxmlformats.org/drawingml/2006/picture">
+                  <pic:nvPicPr>
+                    <pic:cNvPr id="1635802607" name="Picture 5" descr="A map of rivers and rivers&#10;&#10;AI-generated content may be incorrect."/>
+                    <pic:cNvPicPr/>
+                  </pic:nvPicPr>
+                  <pic:blipFill>
+                    <a:blip r:embed="rId6" cstate="print">
+                      <a:extLst>
+                        <a:ext uri="{28A0092B-C50C-407E-A947-70E740481C1C}">
+                          <a14:useLocalDpi xmlns:a14="http://schemas.microsoft.com/office/drawing/2010/main" val="0"/>
+                        </a:ext>
+                      </a:extLst>
+                    </a:blip>
+                    <a:stretch>
+                      <a:fillRect/>
+                    </a:stretch>
+                  </pic:blipFill>
+                  <pic:spPr>
+                    <a:xfrm>
+                      <a:off x="0" y="0"/>
+                      <a:ext cx="4071620" cy="3146425"/>
+                    </a:xfrm>
+                    <a:prstGeom prst="rect">
+                      <a:avLst/>
+                    </a:prstGeom>
+                  </pic:spPr>
+                </pic:pic>
+              </a:graphicData>
+            </a:graphic>
+            <wp14:sizeRelH relativeFrom="page">
+              <wp14:pctWidth>0</wp14:pctWidth>
+            </wp14:sizeRelH>
+            <wp14:sizeRelV relativeFrom="page">
+              <wp14:pctHeight>0</wp14:pctHeight>
+            </wp14:sizeRelV>
+          </wp:anchor>
+        </w:drawing>
+      </w:r>
+      <w:r>
+        <w:rPr>
+          <w:noProof/>
+        </w:rPr>
+        <w:drawing>
+          <wp:anchor distT="0" distB="0" distL="114300" distR="114300" simplePos="0" relativeHeight="251656192" behindDoc="0" locked="0" layoutInCell="1" allowOverlap="1" wp14:anchorId="2CAE6043" wp14:editId="6C39CA27">
+            <wp:simplePos x="0" y="0"/>
+            <wp:positionH relativeFrom="margin">
+              <wp:posOffset>236855</wp:posOffset>
+            </wp:positionH>
+            <wp:positionV relativeFrom="paragraph">
+              <wp:posOffset>3465195</wp:posOffset>
+            </wp:positionV>
+            <wp:extent cx="4071620" cy="3145790"/>
+            <wp:effectExtent l="0" t="0" r="5080" b="3810"/>
+            <wp:wrapSquare wrapText="bothSides"/>
+            <wp:docPr id="649243503" name="Picture 3" descr="A map of different colors and rivers&#10;&#10;AI-generated content may be incorrect."/>
+            <wp:cNvGraphicFramePr>
+              <a:graphicFrameLocks xmlns:a="http://schemas.openxmlformats.org/drawingml/2006/main" noChangeAspect="1"/>
+            </wp:cNvGraphicFramePr>
+            <a:graphic xmlns:a="http://schemas.openxmlformats.org/drawingml/2006/main">
+              <a:graphicData uri="http://schemas.openxmlformats.org/drawingml/2006/picture">
+                <pic:pic xmlns:pic="http://schemas.openxmlformats.org/drawingml/2006/picture">
+                  <pic:nvPicPr>
+                    <pic:cNvPr id="649243503" name="Picture 3" descr="A map of different colors and rivers&#10;&#10;AI-generated content may be incorrect."/>
+                    <pic:cNvPicPr/>
+                  </pic:nvPicPr>
+                  <pic:blipFill>
+                    <a:blip r:embed="rId7" cstate="print">
+                      <a:extLst>
+                        <a:ext uri="{28A0092B-C50C-407E-A947-70E740481C1C}">
+                          <a14:useLocalDpi xmlns:a14="http://schemas.microsoft.com/office/drawing/2010/main" val="0"/>
+                        </a:ext>
+                      </a:extLst>
+                    </a:blip>
+                    <a:stretch>
+                      <a:fillRect/>
+                    </a:stretch>
+                  </pic:blipFill>
+                  <pic:spPr>
+                    <a:xfrm>
+                      <a:off x="0" y="0"/>
+                      <a:ext cx="4071620" cy="3145790"/>
+                    </a:xfrm>
+                    <a:prstGeom prst="rect">
+                      <a:avLst/>
+                    </a:prstGeom>
+                  </pic:spPr>
+                </pic:pic>
+              </a:graphicData>
+            </a:graphic>
+            <wp14:sizeRelH relativeFrom="page">
+              <wp14:pctWidth>0</wp14:pctWidth>
+            </wp14:sizeRelH>
+            <wp14:sizeRelV relativeFrom="page">
+              <wp14:pctHeight>0</wp14:pctHeight>
+            </wp14:sizeRelV>
+          </wp:anchor>
+        </w:drawing>
+      </w:r>
+    </w:p>
+    <w:p>
+      <w:r>
+        <w:rPr>
           <w:noProof/>
         </w:rPr>
         <mc:AlternateContent>
           <mc:Choice Requires="wps">
             <w:drawing>
-              <wp:anchor distT="0" distB="0" distL="114300" distR="114300" simplePos="0" relativeHeight="251659264" behindDoc="0" locked="0" layoutInCell="1" allowOverlap="1" wp14:anchorId="49BE249E" wp14:editId="16DDA3AE">
+              <wp:anchor distT="0" distB="0" distL="114300" distR="114300" simplePos="0" relativeHeight="251660288" behindDoc="0" locked="0" layoutInCell="1" allowOverlap="1" wp14:anchorId="08C727DE" wp14:editId="676CC459">
                 <wp:simplePos x="0" y="0"/>
                 <wp:positionH relativeFrom="column">
-                  <wp:posOffset>-635</wp:posOffset>
+                  <wp:posOffset>68676</wp:posOffset>
                 </wp:positionH>
                 <wp:positionV relativeFrom="paragraph">
-                  <wp:posOffset>6288405</wp:posOffset>
+                  <wp:posOffset>6016000</wp:posOffset>
+                </wp:positionV>
+                <wp:extent cx="1185545" cy="400050"/>
+                <wp:effectExtent l="0" t="0" r="0" b="0"/>
+                <wp:wrapSquare wrapText="bothSides"/>
+                <wp:docPr id="1115512011" name="Text Box 3"/>
+                <wp:cNvGraphicFramePr/>
+                <a:graphic xmlns:a="http://schemas.openxmlformats.org/drawingml/2006/main">
+                  <a:graphicData uri="http://schemas.microsoft.com/office/word/2010/wordprocessingShape">
+                    <wps:wsp>
+                      <wps:cNvSpPr txBox="1"/>
+                      <wps:spPr>
+                        <a:xfrm>
+                          <a:off x="0" y="0"/>
+                          <a:ext cx="1185545" cy="400050"/>
+                        </a:xfrm>
+                        <a:prstGeom prst="rect">
+                          <a:avLst/>
+                        </a:prstGeom>
+                        <a:solidFill>
+                          <a:schemeClr val="lt1">
+                            <a:alpha val="0"/>
+                          </a:schemeClr>
+                        </a:solidFill>
+                        <a:ln w="6350">
+                          <a:noFill/>
+                        </a:ln>
+                      </wps:spPr>
+                      <wps:txbx>
+                        <w:txbxContent>
+                          <w:p>
+                            <w:pPr>
+                              <w:pStyle w:val="ListParagraph"/>
+                              <w:numPr>
+                                <w:ilvl w:val="0"/>
+                                <w:numId w:val="1"/>
+                              </w:numPr>
+                            </w:pPr>
+                          </w:p>
+                        </w:txbxContent>
+                      </wps:txbx>
+                      <wps:bodyPr rot="0" spcFirstLastPara="0" vertOverflow="overflow" horzOverflow="overflow" vert="horz" wrap="square" lIns="91440" tIns="45720" rIns="91440" bIns="45720" numCol="1" spcCol="0" rtlCol="0" fromWordArt="0" anchor="t" anchorCtr="0" forceAA="0" compatLnSpc="1">
+                        <a:prstTxWarp prst="textNoShape">
+                          <a:avLst/>
+                        </a:prstTxWarp>
+                        <a:noAutofit/>
+                      </wps:bodyPr>
+                    </wps:wsp>
+                  </a:graphicData>
+                </a:graphic>
+                <wp14:sizeRelH relativeFrom="margin">
+                  <wp14:pctWidth>0</wp14:pctWidth>
+                </wp14:sizeRelH>
+                <wp14:sizeRelV relativeFrom="margin">
+                  <wp14:pctHeight>0</wp14:pctHeight>
+                </wp14:sizeRelV>
+              </wp:anchor>
+            </w:drawing>
+          </mc:Choice>
+          <mc:Fallback>
+            <w:pict>
+              <v:shapetype w14:anchorId="08C727DE" id="_x0000_t202" coordsize="21600,21600" o:spt="202" path="m,l,21600r21600,l21600,xe">
+                <v:stroke joinstyle="miter"/>
+                <v:path gradientshapeok="t" o:connecttype="rect"/>
+              </v:shapetype>
+              <v:shape id="Text Box 3" o:spid="_x0000_s1026" type="#_x0000_t202" style="position:absolute;margin-left:5.4pt;margin-top:473.7pt;width:93.35pt;height:31.5pt;z-index:251660288;visibility:visible;mso-wrap-style:square;mso-width-percent:0;mso-height-percent:0;mso-wrap-distance-left:9pt;mso-wrap-distance-top:0;mso-wrap-distance-right:9pt;mso-wrap-distance-bottom:0;mso-position-horizontal:absolute;mso-position-horizontal-relative:text;mso-position-vertical:absolute;mso-position-vertical-relative:text;mso-width-percent:0;mso-height-percent:0;mso-width-relative:margin;mso-height-relative:margin;v-text-anchor:top" o:gfxdata="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" fillcolor="white [3201]" stroked="f" strokeweight=".5pt">
+                <v:fill opacity="0"/>
+                <v:textbox>
+                  <w:txbxContent>
+                    <w:p>
+                      <w:pPr>
+                        <w:pStyle w:val="ListParagraph"/>
+                        <w:numPr>
+                          <w:ilvl w:val="0"/>
+                          <w:numId w:val="1"/>
+                        </w:numPr>
+                      </w:pPr>
+                    </w:p>
+                  </w:txbxContent>
+                </v:textbox>
+                <w10:wrap type="square"/>
+              </v:shape>
+            </w:pict>
+          </mc:Fallback>
+        </mc:AlternateContent>
+      </w:r>
+      <w:r>
+        <w:rPr>
+          <w:noProof/>
+        </w:rPr>
+        <mc:AlternateContent>
+          <mc:Choice Requires="wps">
+            <w:drawing>
+              <wp:anchor distT="0" distB="0" distL="114300" distR="114300" simplePos="0" relativeHeight="251659264" behindDoc="0" locked="0" layoutInCell="1" allowOverlap="1" wp14:anchorId="49BE249E" wp14:editId="6BF91170">
+                <wp:simplePos x="0" y="0"/>
+                <wp:positionH relativeFrom="margin">
+                  <wp:posOffset>101109</wp:posOffset>
+                </wp:positionH>
+                <wp:positionV relativeFrom="paragraph">
+                  <wp:posOffset>2889949</wp:posOffset>
                 </wp:positionV>
                 <wp:extent cx="1018540" cy="320040"/>
                 <wp:effectExtent l="0" t="0" r="0" b="0"/>
@@ -288,11 +510,7 @@
           </mc:Choice>
           <mc:Fallback>
             <w:pict>
-              <v:shapetype w14:anchorId="49BE249E" id="_x0000_t202" coordsize="21600,21600" o:spt="202" path="m,l,21600r21600,l21600,xe">
-                <v:stroke joinstyle="miter"/>
-                <v:path gradientshapeok="t" o:connecttype="rect"/>
-              </v:shapetype>
-              <v:shape id="Text Box 3" o:spid="_x0000_s1026" type="#_x0000_t202" style="position:absolute;margin-left:-.05pt;margin-top:495.15pt;width:80.2pt;height:25.2pt;z-index:251661312;visibility:visible;mso-wrap-style:square;mso-width-percent:0;mso-height-percent:0;mso-wrap-distance-left:9pt;mso-wrap-distance-top:0;mso-wrap-distance-right:9pt;mso-wrap-distance-bottom:0;mso-position-horizontal:absolute;mso-position-horizontal-relative:text;mso-position-vertical:absolute;mso-position-vertical-relative:text;mso-width-percent:0;mso-height-percent:0;mso-width-relative:margin;mso-height-relative:margin;v-text-anchor:top" o:gfxdata="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" fillcolor="white [3201]" stroked="f" strokeweight=".5pt">
+              <v:shape w14:anchorId="49BE249E" id="_x0000_s1027" type="#_x0000_t202" style="position:absolute;margin-left:7.95pt;margin-top:227.55pt;width:80.2pt;height:25.2pt;z-index:251659264;visibility:visible;mso-wrap-style:square;mso-width-percent:0;mso-height-percent:0;mso-wrap-distance-left:9pt;mso-wrap-distance-top:0;mso-wrap-distance-right:9pt;mso-wrap-distance-bottom:0;mso-position-horizontal:absolute;mso-position-horizontal-relative:margin;mso-position-vertical:absolute;mso-position-vertical-relative:text;mso-width-percent:0;mso-height-percent:0;mso-width-relative:margin;mso-height-relative:margin;v-text-anchor:top" o:gfxdata="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" fillcolor="white [3201]" stroked="f" strokeweight=".5pt">
                 <v:fill opacity="0"/>
                 <v:textbox>
                   <w:txbxContent>
@@ -307,125 +525,53 @@
                     </w:p>
                   </w:txbxContent>
                 </v:textbox>
-                <w10:wrap type="square"/>
+                <w10:wrap type="square" anchorx="margin"/>
               </v:shape>
             </w:pict>
           </mc:Fallback>
         </mc:AlternateContent>
       </w:r>
       <w:r>
-        <w:rPr>
+        <w:br w:type="page"/>
+      </w:r>
+    </w:p>
+    <w:p>
+      <w:pPr>
+        <w:tabs>
+          <w:tab w:val="left" w:pos="2621"/>
+        </w:tabs>
+        <w:rPr>
+          <w:rFonts w:ascii="Garamond" w:hAnsi="Garamond"/>
+          <w:b/>
+          <w:bCs/>
           <w:noProof/>
-        </w:rPr>
-        <mc:AlternateContent>
-          <mc:Choice Requires="wps">
-            <w:drawing>
-              <wp:anchor distT="0" distB="0" distL="114300" distR="114300" simplePos="0" relativeHeight="251660288" behindDoc="0" locked="0" layoutInCell="1" allowOverlap="1" wp14:anchorId="08C727DE" wp14:editId="53A85F47">
-                <wp:simplePos x="0" y="0"/>
-                <wp:positionH relativeFrom="column">
-                  <wp:posOffset>0</wp:posOffset>
-                </wp:positionH>
-                <wp:positionV relativeFrom="paragraph">
-                  <wp:posOffset>3167532</wp:posOffset>
-                </wp:positionV>
-                <wp:extent cx="1185545" cy="400050"/>
-                <wp:effectExtent l="0" t="0" r="0" b="0"/>
-                <wp:wrapSquare wrapText="bothSides"/>
-                <wp:docPr id="1115512011" name="Text Box 3"/>
-                <wp:cNvGraphicFramePr/>
-                <a:graphic xmlns:a="http://schemas.openxmlformats.org/drawingml/2006/main">
-                  <a:graphicData uri="http://schemas.microsoft.com/office/word/2010/wordprocessingShape">
-                    <wps:wsp>
-                      <wps:cNvSpPr txBox="1"/>
-                      <wps:spPr>
-                        <a:xfrm>
-                          <a:off x="0" y="0"/>
-                          <a:ext cx="1185545" cy="400050"/>
-                        </a:xfrm>
-                        <a:prstGeom prst="rect">
-                          <a:avLst/>
-                        </a:prstGeom>
-                        <a:solidFill>
-                          <a:schemeClr val="lt1">
-                            <a:alpha val="0"/>
-                          </a:schemeClr>
-                        </a:solidFill>
-                        <a:ln w="6350">
-                          <a:noFill/>
-                        </a:ln>
-                      </wps:spPr>
-                      <wps:txbx>
-                        <w:txbxContent>
-                          <w:p>
-                            <w:pPr>
-                              <w:pStyle w:val="ListParagraph"/>
-                              <w:numPr>
-                                <w:ilvl w:val="0"/>
-                                <w:numId w:val="1"/>
-                              </w:numPr>
-                            </w:pPr>
-                          </w:p>
-                        </w:txbxContent>
-                      </wps:txbx>
-                      <wps:bodyPr rot="0" spcFirstLastPara="0" vertOverflow="overflow" horzOverflow="overflow" vert="horz" wrap="square" lIns="91440" tIns="45720" rIns="91440" bIns="45720" numCol="1" spcCol="0" rtlCol="0" fromWordArt="0" anchor="t" anchorCtr="0" forceAA="0" compatLnSpc="1">
-                        <a:prstTxWarp prst="textNoShape">
-                          <a:avLst/>
-                        </a:prstTxWarp>
-                        <a:noAutofit/>
-                      </wps:bodyPr>
-                    </wps:wsp>
-                  </a:graphicData>
-                </a:graphic>
-                <wp14:sizeRelH relativeFrom="margin">
-                  <wp14:pctWidth>0</wp14:pctWidth>
-                </wp14:sizeRelH>
-                <wp14:sizeRelV relativeFrom="margin">
-                  <wp14:pctHeight>0</wp14:pctHeight>
-                </wp14:sizeRelV>
-              </wp:anchor>
-            </w:drawing>
-          </mc:Choice>
-          <mc:Fallback>
-            <w:pict>
-              <v:shape w14:anchorId="08C727DE" id="_x0000_s1027" type="#_x0000_t202" style="position:absolute;margin-left:0;margin-top:249.4pt;width:93.35pt;height:31.5pt;z-index:251662336;visibility:visible;mso-wrap-style:square;mso-width-percent:0;mso-height-percent:0;mso-wrap-distance-left:9pt;mso-wrap-distance-top:0;mso-wrap-distance-right:9pt;mso-wrap-distance-bottom:0;mso-position-horizontal:absolute;mso-position-horizontal-relative:text;mso-position-vertical:absolute;mso-position-vertical-relative:text;mso-width-percent:0;mso-height-percent:0;mso-width-relative:margin;mso-height-relative:margin;v-text-anchor:top" o:gfxdata="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" fillcolor="white [3201]" stroked="f" strokeweight=".5pt">
-                <v:fill opacity="0"/>
-                <v:textbox>
-                  <w:txbxContent>
-                    <w:p>
-                      <w:pPr>
-                        <w:pStyle w:val="ListParagraph"/>
-                        <w:numPr>
-                          <w:ilvl w:val="0"/>
-                          <w:numId w:val="1"/>
-                        </w:numPr>
-                      </w:pPr>
-                    </w:p>
-                  </w:txbxContent>
-                </v:textbox>
-                <w10:wrap type="square"/>
-              </v:shape>
-            </w:pict>
-          </mc:Fallback>
-        </mc:AlternateContent>
-      </w:r>
-      <w:r>
-        <w:rPr>
-          <w:rFonts w:ascii="Garamond" w:hAnsi="Garamond"/>
+          <w:sz w:val="22"/>
+          <w:szCs w:val="22"/>
+        </w:rPr>
+      </w:pPr>
+      <w:r>
+        <w:rPr>
+          <w:rFonts w:ascii="Times New Roman" w:eastAsia="Times New Roman" w:hAnsi="Times New Roman" w:cs="Times New Roman"/>
+          <w:kern w:val="0"/>
+          <w14:ligatures w14:val="none"/>
+        </w:rPr>
+        <w:lastRenderedPageBreak/>
+        <w:t xml:space="preserve"> </w:t>
+      </w:r>
+      <w:r>
+        <w:rPr>
+          <w:rFonts w:ascii="Garamond" w:hAnsi="Garamond"/>
+          <w:b/>
+          <w:bCs/>
           <w:noProof/>
+          <w:sz w:val="22"/>
+          <w:szCs w:val="22"/>
         </w:rPr>
         <w:drawing>
-          <wp:anchor distT="0" distB="0" distL="114300" distR="114300" simplePos="0" relativeHeight="251655168" behindDoc="0" locked="0" layoutInCell="1" allowOverlap="1" wp14:anchorId="2B7003D6" wp14:editId="22C49FF9">
-            <wp:simplePos x="0" y="0"/>
-            <wp:positionH relativeFrom="column">
-              <wp:posOffset>236855</wp:posOffset>
-            </wp:positionH>
-            <wp:positionV relativeFrom="paragraph">
-              <wp:posOffset>315595</wp:posOffset>
-            </wp:positionV>
-            <wp:extent cx="4071620" cy="3146425"/>
-            <wp:effectExtent l="0" t="0" r="5080" b="3175"/>
-            <wp:wrapSquare wrapText="bothSides"/>
-            <wp:docPr id="1635802607" name="Picture 5" descr="A map of rivers and rivers&#10;&#10;AI-generated content may be incorrect."/>
+          <wp:inline distT="0" distB="0" distL="0" distR="0" wp14:anchorId="1BCE565C" wp14:editId="7771D085">
+            <wp:extent cx="5943600" cy="2171700"/>
+            <wp:effectExtent l="0" t="0" r="0" b="0"/>
+            <wp:docPr id="515574590" name="Picture 8"/>
             <wp:cNvGraphicFramePr>
               <a:graphicFrameLocks xmlns:a="http://schemas.openxmlformats.org/drawingml/2006/main" noChangeAspect="1"/>
             </wp:cNvGraphicFramePr>
@@ -433,517 +579,10 @@
               <a:graphicData uri="http://schemas.openxmlformats.org/drawingml/2006/picture">
                 <pic:pic xmlns:pic="http://schemas.openxmlformats.org/drawingml/2006/picture">
                   <pic:nvPicPr>
-                    <pic:cNvPr id="1635802607" name="Picture 5" descr="A map of rivers and rivers&#10;&#10;AI-generated content may be incorrect."/>
-                    <pic:cNvPicPr/>
-                  </pic:nvPicPr>
-                  <pic:blipFill>
-                    <a:blip r:embed="rId6" cstate="print">
-                      <a:extLst>
-                        <a:ext uri="{28A0092B-C50C-407E-A947-70E740481C1C}">
-                          <a14:useLocalDpi xmlns:a14="http://schemas.microsoft.com/office/drawing/2010/main" val="0"/>
-                        </a:ext>
-                      </a:extLst>
-                    </a:blip>
-                    <a:stretch>
-                      <a:fillRect/>
-                    </a:stretch>
-                  </pic:blipFill>
-                  <pic:spPr>
-                    <a:xfrm>
-                      <a:off x="0" y="0"/>
-                      <a:ext cx="4071620" cy="3146425"/>
-                    </a:xfrm>
-                    <a:prstGeom prst="rect">
-                      <a:avLst/>
-                    </a:prstGeom>
-                  </pic:spPr>
-                </pic:pic>
-              </a:graphicData>
-            </a:graphic>
-            <wp14:sizeRelH relativeFrom="page">
-              <wp14:pctWidth>0</wp14:pctWidth>
-            </wp14:sizeRelH>
-            <wp14:sizeRelV relativeFrom="page">
-              <wp14:pctHeight>0</wp14:pctHeight>
-            </wp14:sizeRelV>
-          </wp:anchor>
-        </w:drawing>
-      </w:r>
-      <w:r>
-        <w:rPr>
-          <w:noProof/>
-        </w:rPr>
-        <w:drawing>
-          <wp:anchor distT="0" distB="0" distL="114300" distR="114300" simplePos="0" relativeHeight="251656192" behindDoc="0" locked="0" layoutInCell="1" allowOverlap="1" wp14:anchorId="2CAE6043" wp14:editId="6C39CA27">
-            <wp:simplePos x="0" y="0"/>
-            <wp:positionH relativeFrom="margin">
-              <wp:posOffset>236855</wp:posOffset>
-            </wp:positionH>
-            <wp:positionV relativeFrom="paragraph">
-              <wp:posOffset>3465195</wp:posOffset>
-            </wp:positionV>
-            <wp:extent cx="4071620" cy="3145790"/>
-            <wp:effectExtent l="0" t="0" r="5080" b="3810"/>
-            <wp:wrapSquare wrapText="bothSides"/>
-            <wp:docPr id="649243503" name="Picture 3" descr="A map of different colors and rivers&#10;&#10;AI-generated content may be incorrect."/>
-            <wp:cNvGraphicFramePr>
-              <a:graphicFrameLocks xmlns:a="http://schemas.openxmlformats.org/drawingml/2006/main" noChangeAspect="1"/>
-            </wp:cNvGraphicFramePr>
-            <a:graphic xmlns:a="http://schemas.openxmlformats.org/drawingml/2006/main">
-              <a:graphicData uri="http://schemas.openxmlformats.org/drawingml/2006/picture">
-                <pic:pic xmlns:pic="http://schemas.openxmlformats.org/drawingml/2006/picture">
-                  <pic:nvPicPr>
-                    <pic:cNvPr id="649243503" name="Picture 3" descr="A map of different colors and rivers&#10;&#10;AI-generated content may be incorrect."/>
-                    <pic:cNvPicPr/>
-                  </pic:nvPicPr>
-                  <pic:blipFill>
-                    <a:blip r:embed="rId7" cstate="print">
-                      <a:extLst>
-                        <a:ext uri="{28A0092B-C50C-407E-A947-70E740481C1C}">
-                          <a14:useLocalDpi xmlns:a14="http://schemas.microsoft.com/office/drawing/2010/main" val="0"/>
-                        </a:ext>
-                      </a:extLst>
-                    </a:blip>
-                    <a:stretch>
-                      <a:fillRect/>
-                    </a:stretch>
-                  </pic:blipFill>
-                  <pic:spPr>
-                    <a:xfrm>
-                      <a:off x="0" y="0"/>
-                      <a:ext cx="4071620" cy="3145790"/>
-                    </a:xfrm>
-                    <a:prstGeom prst="rect">
-                      <a:avLst/>
-                    </a:prstGeom>
-                  </pic:spPr>
-                </pic:pic>
-              </a:graphicData>
-            </a:graphic>
-            <wp14:sizeRelH relativeFrom="page">
-              <wp14:pctWidth>0</wp14:pctWidth>
-            </wp14:sizeRelH>
-            <wp14:sizeRelV relativeFrom="page">
-              <wp14:pctHeight>0</wp14:pctHeight>
-            </wp14:sizeRelV>
-          </wp:anchor>
-        </w:drawing>
-      </w:r>
-    </w:p>
-    <w:p>
-      <w:r>
-        <w:br w:type="page"/>
-      </w:r>
-    </w:p>
-    <w:p>
-      <w:pPr>
-        <w:tabs>
-          <w:tab w:val="left" w:pos="2621"/>
-        </w:tabs>
-        <w:rPr>
-          <w:rFonts w:ascii="Garamond" w:hAnsi="Garamond"/>
-          <w:b/>
-          <w:bCs/>
-          <w:sz w:val="22"/>
-          <w:szCs w:val="22"/>
-        </w:rPr>
-      </w:pPr>
-      <w:r>
-        <w:rPr>
-          <w:rFonts w:ascii="Garamond" w:hAnsi="Garamond"/>
-          <w:b/>
-          <w:bCs/>
-          <w:noProof/>
-          <w:sz w:val="22"/>
-          <w:szCs w:val="22"/>
-        </w:rPr>
-        <w:lastRenderedPageBreak/>
-        <mc:AlternateContent>
-          <mc:Choice Requires="wps">
-            <w:drawing>
-              <wp:anchor distT="0" distB="0" distL="114300" distR="114300" simplePos="0" relativeHeight="251661312" behindDoc="0" locked="0" layoutInCell="1" allowOverlap="1" wp14:anchorId="0F2ED082" wp14:editId="7E3D3483">
-                <wp:simplePos x="0" y="0"/>
-                <wp:positionH relativeFrom="column">
-                  <wp:posOffset>4662311</wp:posOffset>
-                </wp:positionH>
-                <wp:positionV relativeFrom="paragraph">
-                  <wp:posOffset>11289</wp:posOffset>
-                </wp:positionV>
-                <wp:extent cx="790222" cy="311185"/>
-                <wp:effectExtent l="0" t="0" r="0" b="0"/>
-                <wp:wrapNone/>
-                <wp:docPr id="1663905613" name="Text Box 9"/>
-                <wp:cNvGraphicFramePr/>
-                <a:graphic xmlns:a="http://schemas.openxmlformats.org/drawingml/2006/main">
-                  <a:graphicData uri="http://schemas.microsoft.com/office/word/2010/wordprocessingShape">
-                    <wps:wsp>
-                      <wps:cNvSpPr txBox="1"/>
-                      <wps:spPr>
-                        <a:xfrm>
-                          <a:off x="0" y="0"/>
-                          <a:ext cx="790222" cy="311185"/>
-                        </a:xfrm>
-                        <a:prstGeom prst="rect">
-                          <a:avLst/>
-                        </a:prstGeom>
-                        <a:noFill/>
-                        <a:ln w="6350">
-                          <a:noFill/>
-                        </a:ln>
-                      </wps:spPr>
-                      <wps:txbx>
-                        <w:txbxContent>
-                          <w:p>
-                            <w:pPr>
-                              <w:pStyle w:val="ListParagraph"/>
-                            </w:pPr>
-                            <w:r>
-                              <w:t>D.</w:t>
-                            </w:r>
-                          </w:p>
-                        </w:txbxContent>
-                      </wps:txbx>
-                      <wps:bodyPr rot="0" spcFirstLastPara="0" vertOverflow="overflow" horzOverflow="overflow" vert="horz" wrap="square" lIns="91440" tIns="45720" rIns="91440" bIns="45720" numCol="1" spcCol="0" rtlCol="0" fromWordArt="0" anchor="t" anchorCtr="0" forceAA="0" compatLnSpc="1">
-                        <a:prstTxWarp prst="textNoShape">
-                          <a:avLst/>
-                        </a:prstTxWarp>
-                        <a:noAutofit/>
-                      </wps:bodyPr>
-                    </wps:wsp>
-                  </a:graphicData>
-                </a:graphic>
-                <wp14:sizeRelH relativeFrom="margin">
-                  <wp14:pctWidth>0</wp14:pctWidth>
-                </wp14:sizeRelH>
-                <wp14:sizeRelV relativeFrom="margin">
-                  <wp14:pctHeight>0</wp14:pctHeight>
-                </wp14:sizeRelV>
-              </wp:anchor>
-            </w:drawing>
-          </mc:Choice>
-          <mc:Fallback>
-            <w:pict>
-              <v:shapetype w14:anchorId="0F2ED082" id="_x0000_t202" coordsize="21600,21600" o:spt="202" path="m,l,21600r21600,l21600,xe">
-                <v:stroke joinstyle="miter"/>
-                <v:path gradientshapeok="t" o:connecttype="rect"/>
-              </v:shapetype>
-              <v:shape id="Text Box 9" o:spid="_x0000_s1026" type="#_x0000_t202" style="position:absolute;margin-left:367.1pt;margin-top:.9pt;width:62.2pt;height:24.5pt;z-index:251662336;visibility:visible;mso-wrap-style:square;mso-width-percent:0;mso-height-percent:0;mso-wrap-distance-left:9pt;mso-wrap-distance-top:0;mso-wrap-distance-right:9pt;mso-wrap-distance-bottom:0;mso-position-horizontal:absolute;mso-position-horizontal-relative:text;mso-position-vertical:absolute;mso-position-vertical-relative:text;mso-width-percent:0;mso-height-percent:0;mso-width-relative:margin;mso-height-relative:margin;v-text-anchor:top" o:gfxdata="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" filled="f" stroked="f" strokeweight=".5pt">
-                <v:textbox>
-                  <w:txbxContent>
-                    <w:p>
-                      <w:pPr>
-                        <w:pStyle w:val="ListParagraph"/>
-                      </w:pPr>
-                      <w:r>
-                        <w:t>D.</w:t>
-                      </w:r>
-                    </w:p>
-                  </w:txbxContent>
-                </v:textbox>
-              </v:shape>
-            </w:pict>
-          </mc:Fallback>
-        </mc:AlternateContent>
-      </w:r>
-      <w:r>
-        <w:rPr>
-          <w:rFonts w:ascii="Garamond" w:hAnsi="Garamond"/>
-          <w:b/>
-          <w:bCs/>
-          <w:noProof/>
-          <w:sz w:val="22"/>
-          <w:szCs w:val="22"/>
-        </w:rPr>
-        <mc:AlternateContent>
-          <mc:Choice Requires="wps">
-            <w:drawing>
-              <wp:anchor distT="0" distB="0" distL="114300" distR="114300" simplePos="0" relativeHeight="251657216" behindDoc="0" locked="0" layoutInCell="1" allowOverlap="1" wp14:anchorId="661AE6CA" wp14:editId="08EFA877">
-                <wp:simplePos x="0" y="0"/>
-                <wp:positionH relativeFrom="column">
-                  <wp:posOffset>2411095</wp:posOffset>
-                </wp:positionH>
-                <wp:positionV relativeFrom="paragraph">
-                  <wp:posOffset>-3175</wp:posOffset>
-                </wp:positionV>
-                <wp:extent cx="622998" cy="311185"/>
-                <wp:effectExtent l="0" t="0" r="0" b="0"/>
-                <wp:wrapNone/>
-                <wp:docPr id="978046690" name="Text Box 9"/>
-                <wp:cNvGraphicFramePr/>
-                <a:graphic xmlns:a="http://schemas.openxmlformats.org/drawingml/2006/main">
-                  <a:graphicData uri="http://schemas.microsoft.com/office/word/2010/wordprocessingShape">
-                    <wps:wsp>
-                      <wps:cNvSpPr txBox="1"/>
-                      <wps:spPr>
-                        <a:xfrm>
-                          <a:off x="0" y="0"/>
-                          <a:ext cx="622998" cy="311185"/>
-                        </a:xfrm>
-                        <a:prstGeom prst="rect">
-                          <a:avLst/>
-                        </a:prstGeom>
-                        <a:noFill/>
-                        <a:ln w="6350">
-                          <a:noFill/>
-                        </a:ln>
-                      </wps:spPr>
-                      <wps:txbx>
-                        <w:txbxContent>
-                          <w:p>
-                            <w:pPr>
-                              <w:ind w:left="360"/>
-                            </w:pPr>
-                            <w:r>
-                              <w:t>B.</w:t>
-                            </w:r>
-                          </w:p>
-                        </w:txbxContent>
-                      </wps:txbx>
-                      <wps:bodyPr rot="0" spcFirstLastPara="0" vertOverflow="overflow" horzOverflow="overflow" vert="horz" wrap="square" lIns="91440" tIns="45720" rIns="91440" bIns="45720" numCol="1" spcCol="0" rtlCol="0" fromWordArt="0" anchor="t" anchorCtr="0" forceAA="0" compatLnSpc="1">
-                        <a:prstTxWarp prst="textNoShape">
-                          <a:avLst/>
-                        </a:prstTxWarp>
-                        <a:noAutofit/>
-                      </wps:bodyPr>
-                    </wps:wsp>
-                  </a:graphicData>
-                </a:graphic>
-                <wp14:sizeRelH relativeFrom="margin">
-                  <wp14:pctWidth>0</wp14:pctWidth>
-                </wp14:sizeRelH>
-                <wp14:sizeRelV relativeFrom="margin">
-                  <wp14:pctHeight>0</wp14:pctHeight>
-                </wp14:sizeRelV>
-              </wp:anchor>
-            </w:drawing>
-          </mc:Choice>
-          <mc:Fallback>
-            <w:pict>
-              <v:shape w14:anchorId="661AE6CA" id="_x0000_s1027" type="#_x0000_t202" style="position:absolute;margin-left:189.85pt;margin-top:-.25pt;width:49.05pt;height:24.5pt;z-index:251660288;visibility:visible;mso-wrap-style:square;mso-width-percent:0;mso-height-percent:0;mso-wrap-distance-left:9pt;mso-wrap-distance-top:0;mso-wrap-distance-right:9pt;mso-wrap-distance-bottom:0;mso-position-horizontal:absolute;mso-position-horizontal-relative:text;mso-position-vertical:absolute;mso-position-vertical-relative:text;mso-width-percent:0;mso-height-percent:0;mso-width-relative:margin;mso-height-relative:margin;v-text-anchor:top" o:gfxdata="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" filled="f" stroked="f" strokeweight=".5pt">
-                <v:textbox>
-                  <w:txbxContent>
-                    <w:p>
-                      <w:pPr>
-                        <w:ind w:left="360"/>
-                      </w:pPr>
-                      <w:r>
-                        <w:t>B.</w:t>
-                      </w:r>
-                    </w:p>
-                  </w:txbxContent>
-                </v:textbox>
-              </v:shape>
-            </w:pict>
-          </mc:Fallback>
-        </mc:AlternateContent>
-      </w:r>
-      <w:r>
-        <w:rPr>
-          <w:rFonts w:ascii="Garamond" w:hAnsi="Garamond"/>
-          <w:b/>
-          <w:bCs/>
-          <w:noProof/>
-          <w:sz w:val="22"/>
-          <w:szCs w:val="22"/>
-        </w:rPr>
-        <mc:AlternateContent>
-          <mc:Choice Requires="wps">
-            <w:drawing>
-              <wp:anchor distT="0" distB="0" distL="114300" distR="114300" simplePos="0" relativeHeight="251658240" behindDoc="0" locked="0" layoutInCell="1" allowOverlap="1" wp14:anchorId="0179F30E" wp14:editId="3E6E15A9">
-                <wp:simplePos x="0" y="0"/>
-                <wp:positionH relativeFrom="column">
-                  <wp:posOffset>3639178</wp:posOffset>
-                </wp:positionH>
-                <wp:positionV relativeFrom="paragraph">
-                  <wp:posOffset>1214</wp:posOffset>
-                </wp:positionV>
-                <wp:extent cx="622998" cy="311185"/>
-                <wp:effectExtent l="0" t="0" r="0" b="0"/>
-                <wp:wrapNone/>
-                <wp:docPr id="1027317102" name="Text Box 9"/>
-                <wp:cNvGraphicFramePr/>
-                <a:graphic xmlns:a="http://schemas.openxmlformats.org/drawingml/2006/main">
-                  <a:graphicData uri="http://schemas.microsoft.com/office/word/2010/wordprocessingShape">
-                    <wps:wsp>
-                      <wps:cNvSpPr txBox="1"/>
-                      <wps:spPr>
-                        <a:xfrm>
-                          <a:off x="0" y="0"/>
-                          <a:ext cx="622998" cy="311185"/>
-                        </a:xfrm>
-                        <a:prstGeom prst="rect">
-                          <a:avLst/>
-                        </a:prstGeom>
-                        <a:noFill/>
-                        <a:ln w="6350">
-                          <a:noFill/>
-                        </a:ln>
-                      </wps:spPr>
-                      <wps:txbx>
-                        <w:txbxContent>
-                          <w:p>
-                            <w:pPr>
-                              <w:ind w:left="360"/>
-                            </w:pPr>
-                            <w:r>
-                              <w:t>C.</w:t>
-                            </w:r>
-                          </w:p>
-                        </w:txbxContent>
-                      </wps:txbx>
-                      <wps:bodyPr rot="0" spcFirstLastPara="0" vertOverflow="overflow" horzOverflow="overflow" vert="horz" wrap="square" lIns="91440" tIns="45720" rIns="91440" bIns="45720" numCol="1" spcCol="0" rtlCol="0" fromWordArt="0" anchor="t" anchorCtr="0" forceAA="0" compatLnSpc="1">
-                        <a:prstTxWarp prst="textNoShape">
-                          <a:avLst/>
-                        </a:prstTxWarp>
-                        <a:noAutofit/>
-                      </wps:bodyPr>
-                    </wps:wsp>
-                  </a:graphicData>
-                </a:graphic>
-                <wp14:sizeRelH relativeFrom="margin">
-                  <wp14:pctWidth>0</wp14:pctWidth>
-                </wp14:sizeRelH>
-                <wp14:sizeRelV relativeFrom="margin">
-                  <wp14:pctHeight>0</wp14:pctHeight>
-                </wp14:sizeRelV>
-              </wp:anchor>
-            </w:drawing>
-          </mc:Choice>
-          <mc:Fallback>
-            <w:pict>
-              <v:shape w14:anchorId="0179F30E" id="_x0000_s1028" type="#_x0000_t202" style="position:absolute;margin-left:286.55pt;margin-top:.1pt;width:49.05pt;height:24.5pt;z-index:251661312;visibility:visible;mso-wrap-style:square;mso-width-percent:0;mso-height-percent:0;mso-wrap-distance-left:9pt;mso-wrap-distance-top:0;mso-wrap-distance-right:9pt;mso-wrap-distance-bottom:0;mso-position-horizontal:absolute;mso-position-horizontal-relative:text;mso-position-vertical:absolute;mso-position-vertical-relative:text;mso-width-percent:0;mso-height-percent:0;mso-width-relative:margin;mso-height-relative:margin;v-text-anchor:top" o:gfxdata="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" filled="f" stroked="f" strokeweight=".5pt">
-                <v:textbox>
-                  <w:txbxContent>
-                    <w:p>
-                      <w:pPr>
-                        <w:ind w:left="360"/>
-                      </w:pPr>
-                      <w:r>
-                        <w:t>C.</w:t>
-                      </w:r>
-                    </w:p>
-                  </w:txbxContent>
-                </v:textbox>
-              </v:shape>
-            </w:pict>
-          </mc:Fallback>
-        </mc:AlternateContent>
-      </w:r>
-      <w:r>
-        <w:rPr>
-          <w:rFonts w:ascii="Garamond" w:hAnsi="Garamond"/>
-          <w:b/>
-          <w:bCs/>
-          <w:noProof/>
-          <w:sz w:val="22"/>
-          <w:szCs w:val="22"/>
-        </w:rPr>
-        <mc:AlternateContent>
-          <mc:Choice Requires="wps">
-            <w:drawing>
-              <wp:anchor distT="0" distB="0" distL="114300" distR="114300" simplePos="0" relativeHeight="251654144" behindDoc="0" locked="0" layoutInCell="1" allowOverlap="1" wp14:anchorId="2041C95E" wp14:editId="16D6D957">
-                <wp:simplePos x="0" y="0"/>
-                <wp:positionH relativeFrom="column">
-                  <wp:posOffset>1125220</wp:posOffset>
-                </wp:positionH>
-                <wp:positionV relativeFrom="paragraph">
-                  <wp:posOffset>-454</wp:posOffset>
-                </wp:positionV>
-                <wp:extent cx="622998" cy="311185"/>
-                <wp:effectExtent l="0" t="0" r="0" b="0"/>
-                <wp:wrapNone/>
-                <wp:docPr id="1130367020" name="Text Box 9"/>
-                <wp:cNvGraphicFramePr/>
-                <a:graphic xmlns:a="http://schemas.openxmlformats.org/drawingml/2006/main">
-                  <a:graphicData uri="http://schemas.microsoft.com/office/word/2010/wordprocessingShape">
-                    <wps:wsp>
-                      <wps:cNvSpPr txBox="1"/>
-                      <wps:spPr>
-                        <a:xfrm>
-                          <a:off x="0" y="0"/>
-                          <a:ext cx="622998" cy="311185"/>
-                        </a:xfrm>
-                        <a:prstGeom prst="rect">
-                          <a:avLst/>
-                        </a:prstGeom>
-                        <a:noFill/>
-                        <a:ln w="6350">
-                          <a:noFill/>
-                        </a:ln>
-                      </wps:spPr>
-                      <wps:txbx>
-                        <w:txbxContent>
-                          <w:p>
-                            <w:pPr>
-                              <w:ind w:left="360"/>
-                            </w:pPr>
-                            <w:r>
-                              <w:t>A.</w:t>
-                            </w:r>
-                          </w:p>
-                        </w:txbxContent>
-                      </wps:txbx>
-                      <wps:bodyPr rot="0" spcFirstLastPara="0" vertOverflow="overflow" horzOverflow="overflow" vert="horz" wrap="square" lIns="91440" tIns="45720" rIns="91440" bIns="45720" numCol="1" spcCol="0" rtlCol="0" fromWordArt="0" anchor="t" anchorCtr="0" forceAA="0" compatLnSpc="1">
-                        <a:prstTxWarp prst="textNoShape">
-                          <a:avLst/>
-                        </a:prstTxWarp>
-                        <a:noAutofit/>
-                      </wps:bodyPr>
-                    </wps:wsp>
-                  </a:graphicData>
-                </a:graphic>
-                <wp14:sizeRelH relativeFrom="margin">
-                  <wp14:pctWidth>0</wp14:pctWidth>
-                </wp14:sizeRelH>
-                <wp14:sizeRelV relativeFrom="margin">
-                  <wp14:pctHeight>0</wp14:pctHeight>
-                </wp14:sizeRelV>
-              </wp:anchor>
-            </w:drawing>
-          </mc:Choice>
-          <mc:Fallback>
-            <w:pict>
-              <v:shape w14:anchorId="2041C95E" id="_x0000_s1029" type="#_x0000_t202" style="position:absolute;margin-left:88.6pt;margin-top:-.05pt;width:49.05pt;height:24.5pt;z-index:251659264;visibility:visible;mso-wrap-style:square;mso-width-percent:0;mso-height-percent:0;mso-wrap-distance-left:9pt;mso-wrap-distance-top:0;mso-wrap-distance-right:9pt;mso-wrap-distance-bottom:0;mso-position-horizontal:absolute;mso-position-horizontal-relative:text;mso-position-vertical:absolute;mso-position-vertical-relative:text;mso-width-percent:0;mso-height-percent:0;mso-width-relative:margin;mso-height-relative:margin;v-text-anchor:top" o:gfxdata="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" filled="f" stroked="f" strokeweight=".5pt">
-                <v:textbox>
-                  <w:txbxContent>
-                    <w:p>
-                      <w:pPr>
-                        <w:ind w:left="360"/>
-                      </w:pPr>
-                      <w:r>
-                        <w:t>A.</w:t>
-                      </w:r>
-                    </w:p>
-                  </w:txbxContent>
-                </v:textbox>
-              </v:shape>
-            </w:pict>
-          </mc:Fallback>
-        </mc:AlternateContent>
-      </w:r>
-      <w:r>
-        <w:rPr>
-          <w:rFonts w:ascii="Garamond" w:hAnsi="Garamond"/>
-          <w:b/>
-          <w:bCs/>
-          <w:noProof/>
-          <w:sz w:val="22"/>
-          <w:szCs w:val="22"/>
-        </w:rPr>
-        <w:drawing>
-          <wp:inline distT="0" distB="0" distL="0" distR="0" wp14:anchorId="4B5CAF4E" wp14:editId="3DBE0EDD">
-            <wp:extent cx="5943600" cy="1697990"/>
-            <wp:effectExtent l="0" t="0" r="0" b="3810"/>
-            <wp:docPr id="1062445846" name="Picture 7" descr="A comparison of a diagram&#10;&#10;AI-generated content may be incorrect."/>
-            <wp:cNvGraphicFramePr>
-              <a:graphicFrameLocks xmlns:a="http://schemas.openxmlformats.org/drawingml/2006/main" noChangeAspect="1"/>
-            </wp:cNvGraphicFramePr>
-            <a:graphic xmlns:a="http://schemas.openxmlformats.org/drawingml/2006/main">
-              <a:graphicData uri="http://schemas.openxmlformats.org/drawingml/2006/picture">
-                <pic:pic xmlns:pic="http://schemas.openxmlformats.org/drawingml/2006/picture">
-                  <pic:nvPicPr>
-                    <pic:cNvPr id="1062445846" name="Picture 7" descr="A comparison of a diagram&#10;&#10;AI-generated content may be incorrect."/>
-                    <pic:cNvPicPr/>
+                    <pic:cNvPr id="0" name="Picture 6"/>
+                    <pic:cNvPicPr>
+                      <a:picLocks noChangeAspect="1" noChangeArrowheads="1"/>
+                    </pic:cNvPicPr>
                   </pic:nvPicPr>
                   <pic:blipFill>
                     <a:blip r:embed="rId8" cstate="print">
@@ -953,18 +592,23 @@
                         </a:ext>
                       </a:extLst>
                     </a:blip>
+                    <a:srcRect/>
                     <a:stretch>
                       <a:fillRect/>
                     </a:stretch>
                   </pic:blipFill>
-                  <pic:spPr>
+                  <pic:spPr bwMode="auto">
                     <a:xfrm>
                       <a:off x="0" y="0"/>
-                      <a:ext cx="5943600" cy="1697990"/>
+                      <a:ext cx="5943600" cy="2171700"/>
                     </a:xfrm>
                     <a:prstGeom prst="rect">
                       <a:avLst/>
                     </a:prstGeom>
+                    <a:noFill/>
+                    <a:ln>
+                      <a:noFill/>
+                    </a:ln>
                   </pic:spPr>
                 </pic:pic>
               </a:graphicData>
@@ -990,83 +634,25 @@
         </w:rPr>
         <w:t>Figure 3</w:t>
       </w:r>
-      <w:r>
-        <w:rPr>
-          <w:rFonts w:ascii="Garamond" w:hAnsi="Garamond"/>
-        </w:rPr>
-        <w:t>:  Median proportion</w:t>
-      </w:r>
-      <w:r>
-        <w:rPr>
-          <w:rFonts w:ascii="Garamond" w:hAnsi="Garamond"/>
-        </w:rPr>
-        <w:t>al</w:t>
-      </w:r>
-      <w:r>
-        <w:rPr>
-          <w:rFonts w:ascii="Garamond" w:hAnsi="Garamond"/>
-        </w:rPr>
-        <w:t xml:space="preserve"> contribution of regional </w:t>
-      </w:r>
-      <w:r>
-        <w:rPr>
-          <w:rFonts w:ascii="Garamond" w:hAnsi="Garamond"/>
-        </w:rPr>
-        <w:t>groups to</w:t>
-      </w:r>
-      <w:r>
-        <w:rPr>
-          <w:rFonts w:ascii="Garamond" w:hAnsi="Garamond"/>
-        </w:rPr>
-        <w:t xml:space="preserve"> each seasonal quartile across all years of the dataset. Boxplots illustrat</w:t>
-      </w:r>
-      <w:r>
-        <w:rPr>
-          <w:rFonts w:ascii="Garamond" w:hAnsi="Garamond"/>
-        </w:rPr>
-        <w:t>e</w:t>
-      </w:r>
-      <w:r>
-        <w:rPr>
-          <w:rFonts w:ascii="Garamond" w:hAnsi="Garamond"/>
-        </w:rPr>
-        <w:t xml:space="preserve"> the range in proportional contribution </w:t>
-      </w:r>
-      <w:r>
-        <w:rPr>
-          <w:rFonts w:ascii="Garamond" w:hAnsi="Garamond"/>
-        </w:rPr>
-        <w:t xml:space="preserve">to each quartile </w:t>
-      </w:r>
-      <w:r>
-        <w:rPr>
-          <w:rFonts w:ascii="Garamond" w:hAnsi="Garamond"/>
-        </w:rPr>
-        <w:t xml:space="preserve">for each </w:t>
-      </w:r>
-      <w:r>
-        <w:rPr>
-          <w:rFonts w:ascii="Garamond" w:hAnsi="Garamond"/>
-        </w:rPr>
-        <w:t xml:space="preserve">stock </w:t>
-      </w:r>
-      <w:r>
-        <w:rPr>
-          <w:rFonts w:ascii="Garamond" w:hAnsi="Garamond"/>
-        </w:rPr>
-        <w:t xml:space="preserve">group across </w:t>
-      </w:r>
-      <w:r>
-        <w:rPr>
-          <w:rFonts w:ascii="Garamond" w:hAnsi="Garamond"/>
-        </w:rPr>
-        <w:t>all years of the</w:t>
-      </w:r>
-      <w:r>
-        <w:rPr>
-          <w:rFonts w:ascii="Garamond" w:hAnsi="Garamond"/>
-        </w:rPr>
-        <w:t xml:space="preserve"> dataset. </w:t>
+      <w:proofErr w:type="gramStart"/>
+      <w:r>
+        <w:rPr>
+          <w:rFonts w:ascii="Garamond" w:hAnsi="Garamond"/>
+        </w:rPr>
+        <w:t xml:space="preserve">:  </w:t>
+      </w:r>
+      <w:r>
+        <w:rPr>
+          <w:rFonts w:ascii="Garamond" w:hAnsi="Garamond"/>
+        </w:rPr>
+        <w:t>A</w:t>
+      </w:r>
+      <w:proofErr w:type="gramEnd"/>
+      <w:r>
+        <w:rPr>
+          <w:rFonts w:ascii="Garamond" w:hAnsi="Garamond"/>
+        </w:rPr>
+        <w:t xml:space="preserve">) Proportional contribution of each regional group to the total number of returning individuals in each quartile across all years of the dataset (2017-2022). Group one and two display a trend of decreasing contribution as the season progresses, but with variable proportional contributions. In contrast, Groups four through six display increasing contribution as the season progresses. B) Total proportional contribution of each regional group to the full return migration across years, displaying variable contribution by group and some variation in relative contribution among years. </w:t>
       </w:r>
     </w:p>
     <w:p/>
@@ -1231,13 +817,7 @@
         <w:rPr>
           <w:rFonts w:ascii="Garamond" w:hAnsi="Garamond"/>
         </w:rPr>
-        <w:t xml:space="preserve">  The proportion of each regional group’s total return protected under several simulated front-end closure scenarios, including the current closure. X-axis labels show the number of days the simulated closure end date differs from the current end date (−3 = June 8, 0 = June 11, +3 = June 14, +6 = June 17). Each point represents a single year, colored bars show the year-to-year range, and black lines denote the median across all years. Colors reflect watershed position, with upstream groups shown in red an</w:t>
-      </w:r>
-      <w:r>
-        <w:rPr>
-          <w:rFonts w:ascii="Garamond" w:hAnsi="Garamond"/>
-        </w:rPr>
-        <w:t>d downstream groups in blue.</w:t>
+        <w:t xml:space="preserve">  The proportion of each regional group’s total return protected under several simulated front-end closure scenarios, including the current closure. X-axis labels show the number of days the simulated closure end date differs from the current end date (−3 = June 8, 0 = June 11, +3 = June 14, +6 = June 17). Each point represents a single year, colored bars show the year-to-year range, and black lines denote the median across all years. Colors reflect watershed position, with upstream groups shown in red and downstream groups in blue.</w:t>
       </w:r>
     </w:p>
     <w:p/>
@@ -2034,7 +1614,6 @@
   <w:style w:type="character" w:default="1" w:styleId="DefaultParagraphFont">
     <w:name w:val="Default Paragraph Font"/>
     <w:uiPriority w:val="1"/>
-    <w:semiHidden/>
     <w:unhideWhenUsed/>
   </w:style>
   <w:style w:type="table" w:default="1" w:styleId="TableNormal">
@@ -2346,6 +1925,17 @@
       <w:smallCaps/>
       <w:color w:val="0F4761" w:themeColor="accent1" w:themeShade="BF"/>
       <w:spacing w:val="5"/>
+    </w:rPr>
+  </w:style>
+  <w:style w:type="paragraph" w:styleId="NormalWeb">
+    <w:name w:val="Normal (Web)"/>
+    <w:basedOn w:val="Normal"/>
+    <w:uiPriority w:val="99"/>
+    <w:semiHidden/>
+    <w:unhideWhenUsed/>
+    <w:rsid w:val="00425CC7"/>
+    <w:rPr>
+      <w:rFonts w:ascii="Times New Roman" w:hAnsi="Times New Roman" w:cs="Times New Roman"/>
     </w:rPr>
   </w:style>
 </w:styles>

</xml_diff>